<commit_message>
Record the I7 figure swap, regenerate its edit doc, update the follow-up email
Co-Authored-By: Claude Fable 5.1 <noreply@anthropic.com>
</commit_message>
<xml_diff>
--- a/Module Edit Docs/I7 - Edit Doc.docx
+++ b/Module Edit Docs/I7 - Edit Doc.docx
@@ -28,7 +28,7 @@
           <w:color w:val="B00000"/>
           <w:sz w:val="21"/>
         </w:rPr>
-        <w:t>ISSUES FLAGGED FOR THIS MODULE (7)</w:t>
+        <w:t>ISSUES FLAGGED FOR THIS MODULE (8)</w:t>
       </w:r>
     </w:p>
     <w:p>
@@ -109,6 +109,16 @@
           <w:sz w:val="19"/>
         </w:rPr>
         <w:t>[NOTE: Figure-placement pass on 2026-09-13 checked the one pasted image in SCRATCH/pasted/I7.manifest.txt (i7-paste3.png, para 63, Gustavo). Skipped: img/i7-venous-compliance-capacitance.svg is already a faithful redraw of the paste (same two panels, same Vu/Vs/capacitance definitions, same vasopressor/ Pms closing statement), matching the prior NOTE above. Nothing placed. lint_page.py i7.html reports 0 problems.]</w:t>
+      </w:r>
+    </w:p>
+    <w:p>
+      <w:r>
+        <w:rPr>
+          <w:i/>
+          <w:color w:val="5A5A5A"/>
+          <w:sz w:val="19"/>
+        </w:rPr>
+        <w:t>[NOTE: On Neal's instruction of 2026-09-13 the SVG redraw was removed and Gustavo's original compliance and capacitance figure is on the page as img/i7-venous-compliance-capacitance.jpg, credited to him.]</w:t>
       </w:r>
     </w:p>
     <w:p/>
@@ -523,7 +533,7 @@
       <w:r>
         <w:drawing>
           <wp:inline xmlns:a="http://schemas.openxmlformats.org/drawingml/2006/main" xmlns:pic="http://schemas.openxmlformats.org/drawingml/2006/picture">
-            <wp:extent cx="2834640" cy="2834640"/>
+            <wp:extent cx="2834640" cy="1702809"/>
             <wp:docPr id="3" name="Picture 3"/>
             <wp:cNvGraphicFramePr>
               <a:graphicFrameLocks noChangeAspect="1"/>
@@ -532,7 +542,7 @@
               <a:graphicData uri="http://schemas.openxmlformats.org/drawingml/2006/picture">
                 <pic:pic>
                   <pic:nvPicPr>
-                    <pic:cNvPr id="0" name="i7-venous-compliance-capacitance.svg.png"/>
+                    <pic:cNvPr id="0" name="i7-venous-compliance-capacitance.jpg"/>
                     <pic:cNvPicPr/>
                   </pic:nvPicPr>
                   <pic:blipFill>
@@ -544,7 +554,7 @@
                   <pic:spPr>
                     <a:xfrm>
                       <a:off x="0" y="0"/>
-                      <a:ext cx="2834640" cy="2834640"/>
+                      <a:ext cx="2834640" cy="1702809"/>
                     </a:xfrm>
                     <a:prstGeom prst="rect"/>
                   </pic:spPr>
@@ -561,7 +571,7 @@
           <w:color w:val="777777"/>
           <w:sz w:val="19"/>
         </w:rPr>
-        <w:t>Compliance and capacitance/capacity are different properties of the same venous pressure-volume relationship. Left, compliance is the slope, ΔV ÷ ΔP: a more compliant venous system accepts a larger change in volume for the same change in transmural pressure. Right, venoconstriction shifts the relationship without necessarily changing its slope, lowering the unstressed-volume intercept and recruiting blood from the unstressed into the stressed compartment. The same total venous volume is therefore held at a higher pressure, raising Pms without requiring either additional blood volume or a change in compliance. In Magder's terminology this is a decrease in venous capacitance. Gelman describes the corresponding change as a decrease in venous capacity.</w:t>
+        <w:t>Compliance and capacitance/capacity are different properties of the same venous pressure-volume relationship. Left, compliance is the slope, ΔV ÷ ΔP: a more compliant venous system accepts a larger change in volume for the same change in transmural pressure. Right, venoconstriction shifts the relationship without necessarily changing its slope, lowering the unstressed-volume intercept and recruiting blood from the unstressed into the stressed compartment. The same total venous volume is therefore held at a higher pressure, raising Pms without requiring either additional blood volume or a change in compliance. In Magder's terminology this is a decrease in venous capacitance. Gelman describes the corresponding change as a decrease in venous capacity. Drawn by Gustavo García Chávez for this module.</w:t>
       </w:r>
     </w:p>
     <w:p>

</xml_diff>